<commit_message>
Stage A step A4 plus runbook corrections (F-42, baseline tag, spine count)
</commit_message>
<xml_diff>
--- a/runbook/00-RUNBOOK-OVERVIEW.docx
+++ b/runbook/00-RUNBOOK-OVERVIEW.docx
@@ -2,32 +2,6 @@
 <file path=word/document.xml><?xml version="1.0" encoding="utf-8"?>
 <w:document xmlns:w="http://schemas.openxmlformats.org/wordprocessingml/2006/main" xmlns:m="http://schemas.openxmlformats.org/officeDocument/2006/math" xmlns:r="http://schemas.openxmlformats.org/officeDocument/2006/relationships" xmlns:o="urn:schemas-microsoft-com:office:office" xmlns:v="urn:schemas-microsoft-com:vml" xmlns:w10="urn:schemas-microsoft-com:office:word" xmlns:a="http://schemas.openxmlformats.org/drawingml/2006/main" xmlns:pic="http://schemas.openxmlformats.org/drawingml/2006/picture" xmlns:wp="http://schemas.openxmlformats.org/drawingml/2006/wordprocessingDrawing">
   <w:body>
-    <w:sdt>
-      <w:sdtPr>
-        <w:docPartObj>
-          <w:docPartGallery w:val="Table of Contents"/>
-          <w:docPartUnique/>
-        </w:docPartObj>
-      </w:sdtPr>
-      <w:sdtContent>
-        <w:p>
-          <w:pPr>
-            <w:pStyle w:val="TOCHeading"/>
-          </w:pPr>
-          <w:r>
-            <w:t xml:space="preserve">Table of Contents</w:t>
-          </w:r>
-        </w:p>
-        <w:p>
-          <w:r>
-            <w:fldChar w:fldCharType="begin" w:dirty="true"/>
-            <w:instrText xml:space="preserve">TOC \o "1-2" \h \z \u</w:instrText>
-            <w:fldChar w:fldCharType="separate"/>
-            <w:fldChar w:fldCharType="end"/>
-          </w:r>
-        </w:p>
-      </w:sdtContent>
-    </w:sdt>
     <w:bookmarkStart w:id="38" w:name="Xb69d54ee4626114b7191565ef02b2757bcfda53"/>
     <w:p>
       <w:pPr>
@@ -4795,13 +4769,13 @@
         <w:t xml:space="preserve"> </w:t>
       </w:r>
       <w:r>
-        <w:t xml:space="preserve">check at all. Beneath it sits 2,124 rows of synthetic operational data in which 66.4% of</w:t>
-      </w:r>
-      <w:r>
-        <w:t xml:space="preserve"> </w:t>
-      </w:r>
-      <w:r>
-        <w:t xml:space="preserve">3,000 events carry no correlation identifier, every one of the six datasets contains three</w:t>
+        <w:t xml:space="preserve">check at all. Beneath it sits 2,124 rows of synthetic operational data in which 983 of</w:t>
+      </w:r>
+      <w:r>
+        <w:t xml:space="preserve"> </w:t>
+      </w:r>
+      <w:r>
+        <w:t xml:space="preserve">3,000 events (32.8%) carry no correlation identifier, every one of the six datasets contains three</w:t>
       </w:r>
       <w:r>
         <w:t xml:space="preserve"> </w:t>

</xml_diff>